<commit_message>
Essai de génération de l'acte de jouissance de congé
</commit_message>
<xml_diff>
--- a/backend/templates/word/attestation_travail_template.docx
+++ b/backend/templates/word/attestation_travail_template.docx
@@ -767,7 +767,37 @@
           <w:sz w:val="28"/>
           <w:szCs w:val="28"/>
         </w:rPr>
-        <w:t xml:space="preserve"> Cotonou, le </w:t>
+        <w:t xml:space="preserve"> </w:t>
+      </w:r>
+    </w:p>
+    <w:p>
+      <w:pPr>
+        <w:spacing w:before="240"/>
+        <w:ind w:left="4248" w:firstLine="708"/>
+        <w:rPr>
+          <w:rFonts w:ascii="Trebuchet MS" w:hAnsi="Trebuchet MS" w:cs="Angsana New"/>
+          <w:noProof/>
+          <w:sz w:val="28"/>
+          <w:szCs w:val="28"/>
+        </w:rPr>
+      </w:pPr>
+      <w:r>
+        <w:rPr>
+          <w:rFonts w:ascii="Trebuchet MS" w:hAnsi="Trebuchet MS" w:cs="Angsana New"/>
+          <w:noProof/>
+          <w:sz w:val="28"/>
+          <w:szCs w:val="28"/>
+        </w:rPr>
+        <w:t xml:space="preserve">Cotonou, le </w:t>
+      </w:r>
+      <w:r>
+        <w:rPr>
+          <w:rFonts w:ascii="Trebuchet MS" w:hAnsi="Trebuchet MS" w:cs="Angsana New"/>
+          <w:noProof/>
+          <w:sz w:val="28"/>
+          <w:szCs w:val="28"/>
+        </w:rPr>
+        <w:t>{{ DATE_AUJOURD_HUI}}</w:t>
       </w:r>
     </w:p>
     <w:p>
@@ -869,7 +899,19 @@
         <w:rPr>
           <w:rFonts w:ascii="Trebuchet MS" w:hAnsi="Trebuchet MS"/>
         </w:rPr>
-        <w:t>N°_________/MND/DPAF/S</w:t>
+        <w:t>N°</w:t>
+      </w:r>
+      <w:r>
+        <w:rPr>
+          <w:rFonts w:ascii="Trebuchet MS" w:hAnsi="Trebuchet MS"/>
+        </w:rPr>
+        <w:t xml:space="preserve"> {{REFERENCE}} </w:t>
+      </w:r>
+      <w:r>
+        <w:rPr>
+          <w:rFonts w:ascii="Trebuchet MS" w:hAnsi="Trebuchet MS"/>
+        </w:rPr>
+        <w:t>/MND/DPAF/S</w:t>
       </w:r>
       <w:r>
         <w:rPr>
@@ -1043,25 +1085,15 @@
           <w:sz w:val="26"/>
           <w:szCs w:val="26"/>
         </w:rPr>
-        <w:t xml:space="preserve">, atteste que Monsieur </w:t>
-      </w:r>
-      <w:r>
-        <w:rPr>
-          <w:rFonts w:ascii="Trebuchet MS" w:eastAsia="Times New Roman" w:hAnsi="Trebuchet MS" w:cs="Arial"/>
-          <w:b/>
-          <w:sz w:val="26"/>
-          <w:szCs w:val="26"/>
-        </w:rPr>
-        <w:t>HODONOU Hounmènou</w:t>
-      </w:r>
-      <w:r>
-        <w:rPr>
-          <w:rFonts w:ascii="Trebuchet MS" w:eastAsia="Times New Roman" w:hAnsi="Trebuchet MS" w:cs="Arial"/>
-          <w:b/>
-          <w:sz w:val="26"/>
-          <w:szCs w:val="26"/>
-        </w:rPr>
-        <w:t xml:space="preserve"> Joachim</w:t>
+        <w:t>, atteste que</w:t>
+      </w:r>
+      <w:r>
+        <w:rPr>
+          <w:rFonts w:ascii="Trebuchet MS" w:hAnsi="Trebuchet MS"/>
+          <w:sz w:val="26"/>
+          <w:szCs w:val="26"/>
+        </w:rPr>
+        <w:t xml:space="preserve"> {{NOM_COMPLET}}</w:t>
       </w:r>
       <w:r>
         <w:rPr>
@@ -1071,27 +1103,57 @@
           <w:sz w:val="26"/>
           <w:szCs w:val="26"/>
         </w:rPr>
+        <w:t>,</w:t>
+      </w:r>
+      <w:r>
+        <w:rPr>
+          <w:rFonts w:ascii="Trebuchet MS" w:hAnsi="Trebuchet MS"/>
+          <w:bCs/>
+          <w:iCs/>
+          <w:sz w:val="26"/>
+          <w:szCs w:val="26"/>
+        </w:rPr>
+        <w:t xml:space="preserve"> {{POSTE}}</w:t>
+      </w:r>
+      <w:r>
+        <w:rPr>
+          <w:rFonts w:ascii="Trebuchet MS" w:hAnsi="Trebuchet MS"/>
+          <w:bCs/>
+          <w:iCs/>
+          <w:sz w:val="26"/>
+          <w:szCs w:val="26"/>
+        </w:rPr>
+        <w:t xml:space="preserve"> </w:t>
+      </w:r>
+      <w:r>
+        <w:rPr>
+          <w:rFonts w:ascii="Trebuchet MS" w:hAnsi="Trebuchet MS"/>
+          <w:bCs/>
+          <w:iCs/>
+          <w:sz w:val="26"/>
+          <w:szCs w:val="26"/>
+        </w:rPr>
         <w:t xml:space="preserve">, </w:t>
       </w:r>
       <w:r>
         <w:rPr>
-          <w:rFonts w:ascii="Trebuchet MS" w:hAnsi="Trebuchet MS"/>
+          <w:rFonts w:ascii="Trebuchet MS" w:eastAsia="Times New Roman" w:hAnsi="Trebuchet MS" w:cs="Times New Roman"/>
           <w:bCs/>
           <w:iCs/>
           <w:sz w:val="26"/>
           <w:szCs w:val="26"/>
         </w:rPr>
-        <w:t>Administrateur</w:t>
-      </w:r>
-      <w:r>
-        <w:rPr>
-          <w:rFonts w:ascii="Trebuchet MS" w:hAnsi="Trebuchet MS"/>
+        <w:t xml:space="preserve">est en service </w:t>
+      </w:r>
+      <w:r>
+        <w:rPr>
+          <w:rFonts w:ascii="Trebuchet MS" w:eastAsia="Times New Roman" w:hAnsi="Trebuchet MS" w:cs="Times New Roman"/>
           <w:bCs/>
           <w:iCs/>
           <w:sz w:val="26"/>
           <w:szCs w:val="26"/>
         </w:rPr>
-        <w:t xml:space="preserve">, </w:t>
+        <w:t>au sein du</w:t>
       </w:r>
       <w:r>
         <w:rPr>
@@ -1101,7 +1163,7 @@
           <w:sz w:val="26"/>
           <w:szCs w:val="26"/>
         </w:rPr>
-        <w:t xml:space="preserve">est en service </w:t>
+        <w:t xml:space="preserve"> Ministère </w:t>
       </w:r>
       <w:r>
         <w:rPr>
@@ -1111,7 +1173,7 @@
           <w:sz w:val="26"/>
           <w:szCs w:val="26"/>
         </w:rPr>
-        <w:t>au sein du</w:t>
+        <w:t>depuis le</w:t>
       </w:r>
       <w:r>
         <w:rPr>
@@ -1121,47 +1183,7 @@
           <w:sz w:val="26"/>
           <w:szCs w:val="26"/>
         </w:rPr>
-        <w:t xml:space="preserve"> Ministère </w:t>
-      </w:r>
-      <w:r>
-        <w:rPr>
-          <w:rFonts w:ascii="Trebuchet MS" w:eastAsia="Times New Roman" w:hAnsi="Trebuchet MS" w:cs="Times New Roman"/>
-          <w:bCs/>
-          <w:iCs/>
-          <w:sz w:val="26"/>
-          <w:szCs w:val="26"/>
-        </w:rPr>
-        <w:t xml:space="preserve">depuis le </w:t>
-      </w:r>
-      <w:r>
-        <w:rPr>
-          <w:rFonts w:ascii="Trebuchet MS" w:eastAsia="Times New Roman" w:hAnsi="Trebuchet MS" w:cs="Times New Roman"/>
-          <w:bCs/>
-          <w:iCs/>
-          <w:sz w:val="26"/>
-          <w:szCs w:val="26"/>
-        </w:rPr>
-        <w:t>04 février</w:t>
-      </w:r>
-      <w:r>
-        <w:rPr>
-          <w:rFonts w:ascii="Trebuchet MS" w:eastAsia="Times New Roman" w:hAnsi="Trebuchet MS" w:cs="Times New Roman"/>
-          <w:bCs/>
-          <w:iCs/>
-          <w:sz w:val="26"/>
-          <w:szCs w:val="26"/>
-        </w:rPr>
-        <w:t xml:space="preserve"> 201</w:t>
-      </w:r>
-      <w:r>
-        <w:rPr>
-          <w:rFonts w:ascii="Trebuchet MS" w:eastAsia="Times New Roman" w:hAnsi="Trebuchet MS" w:cs="Times New Roman"/>
-          <w:bCs/>
-          <w:iCs/>
-          <w:sz w:val="26"/>
-          <w:szCs w:val="26"/>
-        </w:rPr>
-        <w:t>1</w:t>
+        <w:t xml:space="preserve"> {{DATE_PRISE_SERVICE}}</w:t>
       </w:r>
       <w:r>
         <w:rPr>
@@ -1207,97 +1229,7 @@
           <w:sz w:val="26"/>
           <w:szCs w:val="26"/>
         </w:rPr>
-        <w:t>Après sa prise de service</w:t>
-      </w:r>
-      <w:r>
-        <w:rPr>
-          <w:rFonts w:ascii="Trebuchet MS" w:eastAsia="Times New Roman" w:hAnsi="Trebuchet MS" w:cs="Times New Roman"/>
-          <w:sz w:val="26"/>
-          <w:szCs w:val="26"/>
-        </w:rPr>
-        <w:t>, l</w:t>
-      </w:r>
-      <w:r>
-        <w:rPr>
-          <w:rFonts w:ascii="Trebuchet MS" w:eastAsia="Times New Roman" w:hAnsi="Trebuchet MS" w:cs="Times New Roman"/>
-          <w:sz w:val="26"/>
-          <w:szCs w:val="26"/>
-        </w:rPr>
-        <w:t xml:space="preserve">’intéressé </w:t>
-      </w:r>
-      <w:r>
-        <w:rPr>
-          <w:rFonts w:ascii="Trebuchet MS" w:eastAsia="Times New Roman" w:hAnsi="Trebuchet MS" w:cs="Times New Roman"/>
-          <w:sz w:val="26"/>
-          <w:szCs w:val="26"/>
-        </w:rPr>
-        <w:t xml:space="preserve">a été chef de Service de Coopération de la Direction de la Programmation et de la Prospective (DPP) et ensuite dirigé </w:t>
-      </w:r>
-      <w:r>
-        <w:rPr>
-          <w:rFonts w:ascii="Trebuchet MS" w:eastAsia="Times New Roman" w:hAnsi="Trebuchet MS" w:cs="Times New Roman"/>
-          <w:sz w:val="26"/>
-          <w:szCs w:val="26"/>
-        </w:rPr>
-        <w:t>l</w:t>
-      </w:r>
-      <w:r>
-        <w:rPr>
-          <w:rFonts w:ascii="Trebuchet MS" w:eastAsia="Times New Roman" w:hAnsi="Trebuchet MS" w:cs="Times New Roman"/>
-          <w:sz w:val="26"/>
-          <w:szCs w:val="26"/>
-        </w:rPr>
-        <w:t>e service de la Planification et de Suivi</w:t>
-      </w:r>
-      <w:r>
-        <w:rPr>
-          <w:rFonts w:ascii="Trebuchet MS" w:eastAsia="Times New Roman" w:hAnsi="Trebuchet MS" w:cs="Times New Roman"/>
-          <w:sz w:val="26"/>
-          <w:szCs w:val="26"/>
-        </w:rPr>
-        <w:t>-</w:t>
-      </w:r>
-      <w:r>
-        <w:rPr>
-          <w:rFonts w:ascii="Trebuchet MS" w:eastAsia="Times New Roman" w:hAnsi="Trebuchet MS" w:cs="Times New Roman"/>
-          <w:sz w:val="26"/>
-          <w:szCs w:val="26"/>
-        </w:rPr>
-        <w:t>Evaluation</w:t>
-      </w:r>
-      <w:r>
-        <w:rPr>
-          <w:rFonts w:ascii="Trebuchet MS" w:eastAsia="Times New Roman" w:hAnsi="Trebuchet MS" w:cs="Times New Roman"/>
-          <w:sz w:val="26"/>
-          <w:szCs w:val="26"/>
-        </w:rPr>
-        <w:t xml:space="preserve"> </w:t>
-      </w:r>
-      <w:r>
-        <w:rPr>
-          <w:rFonts w:ascii="Trebuchet MS" w:hAnsi="Trebuchet MS"/>
-          <w:bCs/>
-          <w:iCs/>
-          <w:sz w:val="26"/>
-          <w:szCs w:val="26"/>
-        </w:rPr>
-        <w:t>de</w:t>
-      </w:r>
-      <w:r>
-        <w:rPr>
-          <w:rFonts w:ascii="Trebuchet MS" w:eastAsia="Times New Roman" w:hAnsi="Trebuchet MS" w:cs="Times New Roman"/>
-          <w:sz w:val="26"/>
-          <w:szCs w:val="26"/>
-        </w:rPr>
-        <w:t xml:space="preserve"> la Direction de la Planification, de l’Administration et des Finances</w:t>
-      </w:r>
-      <w:r>
-        <w:rPr>
-          <w:rFonts w:ascii="Trebuchet MS" w:eastAsia="Times New Roman" w:hAnsi="Trebuchet MS" w:cs="Times New Roman"/>
-          <w:sz w:val="26"/>
-          <w:szCs w:val="26"/>
-        </w:rPr>
-        <w:t>.</w:t>
+        <w:t>Après sa prise de service, l'intéressé a occupé plusieurs postes à responsabilité</w:t>
       </w:r>
     </w:p>
     <w:p>
@@ -1306,7 +1238,6 @@
           <w:tab w:val="left" w:pos="1610"/>
         </w:tabs>
         <w:spacing w:after="0" w:line="360" w:lineRule="auto"/>
-        <w:ind w:firstLine="709"/>
         <w:jc w:val="both"/>
         <w:rPr>
           <w:rFonts w:ascii="Trebuchet MS" w:eastAsia="Times New Roman" w:hAnsi="Trebuchet MS" w:cs="Times New Roman"/>
@@ -1314,6 +1245,14 @@
           <w:szCs w:val="8"/>
         </w:rPr>
       </w:pPr>
+      <w:r>
+        <w:rPr>
+          <w:rFonts w:ascii="Trebuchet MS" w:eastAsia="Times New Roman" w:hAnsi="Trebuchet MS" w:cs="Times New Roman"/>
+          <w:sz w:val="26"/>
+          <w:szCs w:val="26"/>
+        </w:rPr>
+        <w:t>au sein du Ministère.</w:t>
+      </w:r>
     </w:p>
     <w:p>
       <w:pPr>
@@ -1401,6 +1340,7 @@
         </w:rPr>
         <w:tab/>
       </w:r>
+      <w:proofErr w:type="spellStart"/>
       <w:r>
         <w:rPr>
           <w:rFonts w:ascii="Trebuchet MS" w:hAnsi="Trebuchet MS"/>
@@ -1408,7 +1348,17 @@
           <w:sz w:val="26"/>
           <w:szCs w:val="26"/>
         </w:rPr>
-        <w:t>Comlan Amour Abel KPOCHEME</w:t>
+        <w:t>Comlan</w:t>
+      </w:r>
+      <w:proofErr w:type="spellEnd"/>
+      <w:r>
+        <w:rPr>
+          <w:rFonts w:ascii="Trebuchet MS" w:hAnsi="Trebuchet MS"/>
+          <w:b/>
+          <w:sz w:val="26"/>
+          <w:szCs w:val="26"/>
+        </w:rPr>
+        <w:t xml:space="preserve"> Amour Abel KPOCHEME</w:t>
       </w:r>
     </w:p>
     <w:p>

</xml_diff>